<commit_message>
Publish non-judicial Doubao mobile release
</commit_message>
<xml_diff>
--- a/codex-plugin/skills/post-loan-portal-check/assets/贷后查询模板.docx
+++ b/codex-plugin/skills/post-loan-portal-check/assets/贷后查询模板.docx
@@ -12,7 +12,7 @@
           <wp:inline distT="0" distB="0" distL="0" distR="0" wp14:anchorId="372BEF7B" wp14:editId="0B408E53">
             <wp:extent cx="5274310" cy="3138170"/>
             <wp:effectExtent l="0" t="0" r="2540" b="5080"/>
-            <wp:docPr id="871893654" name="图片 1" descr="河南省应急管理厅 网站检索 和另外 2 个页面 - 个人 - Microsoft​ Edge"/>
+            <wp:docPr id="871893654" name="图片 1" descr="公开源页面 网站检索 和另外 2 个页面 - 个人 - Microsoft​ Edge"/>
             <wp:cNvGraphicFramePr>
               <a:graphicFrameLocks xmlns:a="http://schemas.openxmlformats.org/drawingml/2006/main" noChangeAspect="1"/>
             </wp:cNvGraphicFramePr>
@@ -20,7 +20,7 @@
               <a:graphicData uri="http://schemas.openxmlformats.org/drawingml/2006/picture">
                 <pic:pic xmlns:pic="http://schemas.openxmlformats.org/drawingml/2006/picture">
                   <pic:nvPicPr>
-                    <pic:cNvPr id="871893654" name="图片 871893654" descr="河南省应急管理厅 网站检索 和另外 2 个页面 - 个人 - Microsoft​ Edge"/>
+                    <pic:cNvPr id="871893654" name="图片 871893654" descr="公开源页面 网站检索 和另外 2 个页面 - 个人 - Microsoft​ Edge"/>
                     <pic:cNvPicPr/>
                   </pic:nvPicPr>
                   <pic:blipFill>
@@ -61,7 +61,7 @@
           <wp:inline distT="0" distB="0" distL="0" distR="0" wp14:anchorId="46633EC4" wp14:editId="66070148">
             <wp:extent cx="5274310" cy="3138170"/>
             <wp:effectExtent l="0" t="0" r="2540" b="5080"/>
-            <wp:docPr id="2111526469" name="图片 2" descr="河南省生态环境厅 网站检索 和另外 2 个页面 - 个人 - Microsoft​ Edge"/>
+            <wp:docPr id="2111526469" name="图片 2" descr="公开源页面 网站检索 和另外 2 个页面 - 个人 - Microsoft​ Edge"/>
             <wp:cNvGraphicFramePr>
               <a:graphicFrameLocks xmlns:a="http://schemas.openxmlformats.org/drawingml/2006/main" noChangeAspect="1"/>
             </wp:cNvGraphicFramePr>
@@ -69,7 +69,7 @@
               <a:graphicData uri="http://schemas.openxmlformats.org/drawingml/2006/picture">
                 <pic:pic xmlns:pic="http://schemas.openxmlformats.org/drawingml/2006/picture">
                   <pic:nvPicPr>
-                    <pic:cNvPr id="2111526469" name="图片 2111526469" descr="河南省生态环境厅 网站检索 和另外 2 个页面 - 个人 - Microsoft​ Edge"/>
+                    <pic:cNvPr id="2111526469" name="图片 2111526469" descr="公开源页面 网站检索 和另外 2 个页面 - 个人 - Microsoft​ Edge"/>
                     <pic:cNvPicPr/>
                   </pic:nvPicPr>
                   <pic:blipFill>
@@ -111,7 +111,7 @@
           <wp:inline distT="0" distB="0" distL="0" distR="0" wp14:anchorId="43094DB5" wp14:editId="71806747">
             <wp:extent cx="5274310" cy="3138170"/>
             <wp:effectExtent l="0" t="0" r="2540" b="5080"/>
-            <wp:docPr id="739535404" name="图片 3" descr="河南省市场监督管理局 网站检索 和另外 2 个页面 - 个人 - Microsoft​ Edge"/>
+            <wp:docPr id="739535404" name="图片 3" descr="公开源页面 网站检索 和另外 2 个页面 - 个人 - Microsoft​ Edge"/>
             <wp:cNvGraphicFramePr>
               <a:graphicFrameLocks xmlns:a="http://schemas.openxmlformats.org/drawingml/2006/main" noChangeAspect="1"/>
             </wp:cNvGraphicFramePr>
@@ -119,7 +119,7 @@
               <a:graphicData uri="http://schemas.openxmlformats.org/drawingml/2006/picture">
                 <pic:pic xmlns:pic="http://schemas.openxmlformats.org/drawingml/2006/picture">
                   <pic:nvPicPr>
-                    <pic:cNvPr id="739535404" name="图片 739535404" descr="河南省市场监督管理局 网站检索 和另外 2 个页面 - 个人 - Microsoft​ Edge"/>
+                    <pic:cNvPr id="739535404" name="图片 739535404" descr="公开源页面 网站检索 和另外 2 个页面 - 个人 - Microsoft​ Edge"/>
                     <pic:cNvPicPr/>
                   </pic:nvPicPr>
                   <pic:blipFill>
@@ -259,7 +259,7 @@
           <wp:inline distT="0" distB="0" distL="0" distR="0" wp14:anchorId="1D36CC2B" wp14:editId="1D7723BF">
             <wp:extent cx="5274310" cy="3138170"/>
             <wp:effectExtent l="0" t="0" r="2540" b="5080"/>
-            <wp:docPr id="873576186" name="图片 6" descr="濮阳市中建黄河大桥工程管理有限公司_百度搜索 - 个人 - Microsoft​ Edge"/>
+            <wp:docPr id="873576186" name="图片 6" descr="企业名称_百度搜索 - 个人 - Microsoft​ Edge"/>
             <wp:cNvGraphicFramePr>
               <a:graphicFrameLocks xmlns:a="http://schemas.openxmlformats.org/drawingml/2006/main" noChangeAspect="1"/>
             </wp:cNvGraphicFramePr>
@@ -267,7 +267,7 @@
               <a:graphicData uri="http://schemas.openxmlformats.org/drawingml/2006/picture">
                 <pic:pic xmlns:pic="http://schemas.openxmlformats.org/drawingml/2006/picture">
                   <pic:nvPicPr>
-                    <pic:cNvPr id="873576186" name="图片 873576186" descr="濮阳市中建黄河大桥工程管理有限公司_百度搜索 - 个人 - Microsoft​ Edge"/>
+                    <pic:cNvPr id="873576186" name="图片 873576186" descr="企业名称_百度搜索 - 个人 - Microsoft​ Edge"/>
                     <pic:cNvPicPr/>
                   </pic:nvPicPr>
                   <pic:blipFill>
@@ -309,7 +309,7 @@
           <wp:inline distT="0" distB="0" distL="0" distR="0" wp14:anchorId="5A95160E" wp14:editId="2535D69E">
             <wp:extent cx="5274310" cy="3138170"/>
             <wp:effectExtent l="0" t="0" r="2540" b="5080"/>
-            <wp:docPr id="517610114" name="图片 7" descr="濮阳市中建黄河大桥工程管理有限公司_百度搜索 - 个人 - Microsoft​ Edge"/>
+            <wp:docPr id="517610114" name="图片 7" descr="企业名称_百度搜索 - 个人 - Microsoft​ Edge"/>
             <wp:cNvGraphicFramePr>
               <a:graphicFrameLocks xmlns:a="http://schemas.openxmlformats.org/drawingml/2006/main" noChangeAspect="1"/>
             </wp:cNvGraphicFramePr>
@@ -317,7 +317,7 @@
               <a:graphicData uri="http://schemas.openxmlformats.org/drawingml/2006/picture">
                 <pic:pic xmlns:pic="http://schemas.openxmlformats.org/drawingml/2006/picture">
                   <pic:nvPicPr>
-                    <pic:cNvPr id="517610114" name="图片 517610114" descr="濮阳市中建黄河大桥工程管理有限公司_百度搜索 - 个人 - Microsoft​ Edge"/>
+                    <pic:cNvPr id="517610114" name="图片 517610114" descr="企业名称_百度搜索 - 个人 - Microsoft​ Edge"/>
                     <pic:cNvPicPr/>
                   </pic:nvPicPr>
                   <pic:blipFill>
@@ -358,7 +358,7 @@
           <wp:inline distT="0" distB="0" distL="0" distR="0" wp14:anchorId="6C445F32" wp14:editId="5DF899EC">
             <wp:extent cx="5274310" cy="3138170"/>
             <wp:effectExtent l="0" t="0" r="2540" b="5080"/>
-            <wp:docPr id="1293312819" name="图片 8" descr="濮阳市中建黄河大桥工程管理有限公司_百度搜索 - 个人 - Microsoft​ Edge"/>
+            <wp:docPr id="1293312819" name="图片 8" descr="企业名称_百度搜索 - 个人 - Microsoft​ Edge"/>
             <wp:cNvGraphicFramePr>
               <a:graphicFrameLocks xmlns:a="http://schemas.openxmlformats.org/drawingml/2006/main" noChangeAspect="1"/>
             </wp:cNvGraphicFramePr>
@@ -366,7 +366,7 @@
               <a:graphicData uri="http://schemas.openxmlformats.org/drawingml/2006/picture">
                 <pic:pic xmlns:pic="http://schemas.openxmlformats.org/drawingml/2006/picture">
                   <pic:nvPicPr>
-                    <pic:cNvPr id="1293312819" name="图片 1293312819" descr="濮阳市中建黄河大桥工程管理有限公司_百度搜索 - 个人 - Microsoft​ Edge"/>
+                    <pic:cNvPr id="1293312819" name="图片 1293312819" descr="企业名称_百度搜索 - 个人 - Microsoft​ Edge"/>
                     <pic:cNvPicPr/>
                   </pic:nvPicPr>
                   <pic:blipFill>
@@ -408,7 +408,7 @@
           <wp:inline distT="0" distB="0" distL="0" distR="0" wp14:anchorId="3E9CFA78" wp14:editId="12B5A7F2">
             <wp:extent cx="5274310" cy="3138170"/>
             <wp:effectExtent l="0" t="0" r="2540" b="5080"/>
-            <wp:docPr id="1137461536" name="图片 9" descr="濮阳市中建黄河大桥工程管理有限公司_百度搜索 - 个人 - Microsoft​ Edge"/>
+            <wp:docPr id="1137461536" name="图片 9" descr="企业名称_百度搜索 - 个人 - Microsoft​ Edge"/>
             <wp:cNvGraphicFramePr>
               <a:graphicFrameLocks xmlns:a="http://schemas.openxmlformats.org/drawingml/2006/main" noChangeAspect="1"/>
             </wp:cNvGraphicFramePr>
@@ -416,7 +416,7 @@
               <a:graphicData uri="http://schemas.openxmlformats.org/drawingml/2006/picture">
                 <pic:pic xmlns:pic="http://schemas.openxmlformats.org/drawingml/2006/picture">
                   <pic:nvPicPr>
-                    <pic:cNvPr id="1137461536" name="图片 1137461536" descr="濮阳市中建黄河大桥工程管理有限公司_百度搜索 - 个人 - Microsoft​ Edge"/>
+                    <pic:cNvPr id="1137461536" name="图片 1137461536" descr="企业名称_百度搜索 - 个人 - Microsoft​ Edge"/>
                     <pic:cNvPicPr/>
                   </pic:nvPicPr>
                   <pic:blipFill>
@@ -457,7 +457,7 @@
           <wp:inline distT="0" distB="0" distL="0" distR="0" wp14:anchorId="62F8455C" wp14:editId="195FFE90">
             <wp:extent cx="5274310" cy="3138170"/>
             <wp:effectExtent l="0" t="0" r="2540" b="5080"/>
-            <wp:docPr id="1508442987" name="图片 10" descr="濮阳市中建黄河大桥工程管理有限公司_百度搜索 - 个人 - Microsoft​ Edge"/>
+            <wp:docPr id="1508442987" name="图片 10" descr="企业名称_百度搜索 - 个人 - Microsoft​ Edge"/>
             <wp:cNvGraphicFramePr>
               <a:graphicFrameLocks xmlns:a="http://schemas.openxmlformats.org/drawingml/2006/main" noChangeAspect="1"/>
             </wp:cNvGraphicFramePr>
@@ -465,7 +465,7 @@
               <a:graphicData uri="http://schemas.openxmlformats.org/drawingml/2006/picture">
                 <pic:pic xmlns:pic="http://schemas.openxmlformats.org/drawingml/2006/picture">
                   <pic:nvPicPr>
-                    <pic:cNvPr id="1508442987" name="图片 1508442987" descr="濮阳市中建黄河大桥工程管理有限公司_百度搜索 - 个人 - Microsoft​ Edge"/>
+                    <pic:cNvPr id="1508442987" name="图片 1508442987" descr="企业名称_百度搜索 - 个人 - Microsoft​ Edge"/>
                     <pic:cNvPicPr/>
                   </pic:nvPicPr>
                   <pic:blipFill>
@@ -507,7 +507,7 @@
           <wp:inline distT="0" distB="0" distL="0" distR="0" wp14:anchorId="1D633848" wp14:editId="030607A5">
             <wp:extent cx="5274310" cy="3138170"/>
             <wp:effectExtent l="0" t="0" r="2540" b="5080"/>
-            <wp:docPr id="217129522" name="图片 11" descr="濮阳市中建黄河大桥工程管理有限公司_百度搜索 - 个人 - Microsoft​ Edge"/>
+            <wp:docPr id="217129522" name="图片 11" descr="企业名称_百度搜索 - 个人 - Microsoft​ Edge"/>
             <wp:cNvGraphicFramePr>
               <a:graphicFrameLocks xmlns:a="http://schemas.openxmlformats.org/drawingml/2006/main" noChangeAspect="1"/>
             </wp:cNvGraphicFramePr>
@@ -515,7 +515,7 @@
               <a:graphicData uri="http://schemas.openxmlformats.org/drawingml/2006/picture">
                 <pic:pic xmlns:pic="http://schemas.openxmlformats.org/drawingml/2006/picture">
                   <pic:nvPicPr>
-                    <pic:cNvPr id="217129522" name="图片 217129522" descr="濮阳市中建黄河大桥工程管理有限公司_百度搜索 - 个人 - Microsoft​ Edge"/>
+                    <pic:cNvPr id="217129522" name="图片 217129522" descr="企业名称_百度搜索 - 个人 - Microsoft​ Edge"/>
                     <pic:cNvPicPr/>
                   </pic:nvPicPr>
                   <pic:blipFill>
@@ -561,7 +561,7 @@
           <wp:inline distT="0" distB="0" distL="0" distR="0" wp14:anchorId="3F9BFCC9" wp14:editId="6F509F8E">
             <wp:extent cx="5274310" cy="3138170"/>
             <wp:effectExtent l="0" t="0" r="2540" b="5080"/>
-            <wp:docPr id="682811510" name="图片 12" descr="濮阳市中建黄河大桥工程管理有限公司_百度搜索 - 个人 - Microsoft​ Edge"/>
+            <wp:docPr id="682811510" name="图片 12" descr="企业名称_百度搜索 - 个人 - Microsoft​ Edge"/>
             <wp:cNvGraphicFramePr>
               <a:graphicFrameLocks xmlns:a="http://schemas.openxmlformats.org/drawingml/2006/main" noChangeAspect="1"/>
             </wp:cNvGraphicFramePr>
@@ -569,7 +569,7 @@
               <a:graphicData uri="http://schemas.openxmlformats.org/drawingml/2006/picture">
                 <pic:pic xmlns:pic="http://schemas.openxmlformats.org/drawingml/2006/picture">
                   <pic:nvPicPr>
-                    <pic:cNvPr id="682811510" name="图片 682811510" descr="濮阳市中建黄河大桥工程管理有限公司_百度搜索 - 个人 - Microsoft​ Edge"/>
+                    <pic:cNvPr id="682811510" name="图片 682811510" descr="企业名称_百度搜索 - 个人 - Microsoft​ Edge"/>
                     <pic:cNvPicPr/>
                   </pic:nvPicPr>
                   <pic:blipFill>

</xml_diff>